<commit_message>
implemented benchmarks , comparative evaluation
</commit_message>
<xml_diff>
--- a/AI_Driven_Consensus_Project_Report.docx
+++ b/AI_Driven_Consensus_Project_Report.docx
@@ -76,7 +76,7 @@
           </w:tcPr>
           <w:p>
             <w:r>
-              <w:t>Blockchain, Internet of Things (IoT), Edge AI &amp; Multi-Agent Consensus</w:t>
+              <w:t>Blockchain, Internet of Things (IoT), Edge AI &amp; Deep Reinforcement Learning</w:t>
             </w:r>
           </w:p>
         </w:tc>
@@ -115,7 +115,7 @@
           </w:tcPr>
           <w:p>
             <w:r>
-              <w:t>Mid-Semester Review Deliverable (Phase 1, Phase 2, &amp; Phase 3)</w:t>
+              <w:t>Final Project Report (Phases 1 through 6 Complete)</w:t>
             </w:r>
           </w:p>
         </w:tc>
@@ -154,7 +154,7 @@
           </w:tcPr>
           <w:p>
             <w:r>
-              <w:t>Decoupled 3-Tier Architecture (EVM Settlement + Off-Chain AI Controller)</w:t>
+              <w:t>Decoupled 3-Tier Architecture (EVM Settlement + DRL Off-Chain Controller)</w:t>
             </w:r>
           </w:p>
         </w:tc>
@@ -193,7 +193,7 @@
           </w:tcPr>
           <w:p>
             <w:r>
-              <w:t>September 2026 / Version 1.0 (Functional Prototype Verified)</w:t>
+              <w:t>October 2026 / Version 2.0 (Full Empirical Benchmarking &amp; Defense Verified)</w:t>
             </w:r>
           </w:p>
         </w:tc>
@@ -1559,7 +1559,15 @@
           <w:color w:val="1F4E79"/>
           <w:sz w:val="34"/>
         </w:rPr>
-        <w:t>6. Post Mid-Term Roadmap &amp; Complete Project Vision</w:t>
+        <w:t>6. Machine Learning Advancement: Deep Reinforcement Learning (Phase 4)</w:t>
+      </w:r>
+    </w:p>
+    <w:p>
+      <w:pPr>
+        <w:spacing w:after="120" w:line="276" w:lineRule="auto"/>
+      </w:pPr>
+      <w:r>
+        <w:t>To elevate the system beyond static heuristic weighting, Phase 4 formalizes dynamic committee selection as a Markov Decision Process (MDP) implemented in an OpenAI Gymnasium environment (IoTConsensusEnv). An Actor-Critic neural network trained using Proximal Policy Optimization (PPO) with Generalized Advantage Estimation (GAE) learns non-linear policies that anticipate fleet depletion cascades under volatile network traffic.</w:t>
       </w:r>
     </w:p>
     <w:p>
@@ -1573,7 +1581,7 @@
           <w:color w:val="2E75B6"/>
           <w:sz w:val="26"/>
         </w:rPr>
-        <w:t>6.1 Phase 4: Advancing to Deep Reinforcement Learning (DQN / PPO)</w:t>
+        <w:t>6.1 State and Action Space Formulations</w:t>
       </w:r>
     </w:p>
     <w:p>
@@ -1581,7 +1589,15 @@
         <w:spacing w:after="120" w:line="276" w:lineRule="auto"/>
       </w:pPr>
       <w:r>
-        <w:t>In Phase 4, the static Multi-Criteria Decision Making (MCDM) heuristic will be replaced with a Deep Reinforcement Learning agent. The state space (S_t) comprises residual battery vectors, channel latency, packet drop rates, and block finality intervals. The action space (A_t) determines the dynamic committee size K_t and the node selection mask. The agent learns non-linear policies that anticipate depletion cascades before they occur.</w:t>
+        <w:t>Observation Space (S_t in R^(4N + 2)): For each of the N IoT nodes, the state vector captures: [Residual Battery %, Link Latency ms, Historical Reputation Score, Leadership Fatigue Ratio]. This is concatenated with two global scalars: the fleet viability ratio (nodes above 15% battery) and normalized epoch progress.</w:t>
+      </w:r>
+    </w:p>
+    <w:p>
+      <w:pPr>
+        <w:spacing w:after="120" w:line="276" w:lineRule="auto"/>
+      </w:pPr>
+      <w:r>
+        <w:t>Action Space (A_t in R^(N + 1)): The continuous action vector outputs a continuous logit for dynamic committee sizing K_t (decoded via sigmoid into the valid Byzantine range [3f+1, K_max]), alongside N continuous priority logits for candidate ranking.</w:t>
       </w:r>
     </w:p>
     <w:p>
@@ -1595,7 +1611,7 @@
           <w:color w:val="2E75B6"/>
           <w:sz w:val="26"/>
         </w:rPr>
-        <w:t>6.2 Phase 5: Adversarial Stress Testing &amp; Byzantine Defense</w:t>
+        <w:t>6.2 Composite Multi-Objective Reward Function</w:t>
       </w:r>
     </w:p>
     <w:p>
@@ -1603,7 +1619,33 @@
         <w:spacing w:after="120" w:line="276" w:lineRule="auto"/>
       </w:pPr>
       <w:r>
-        <w:t>Phase 5 introduces explicit adversarial injection: (1) Telemetry Spoofing (dishonest nodes reporting false battery levels to avoid work or hijack leadership), mitigated via Kalman filtering and physics cross-validation; (2) Byzantine Double-Signing, mitigated via on-chain cryptographic slashing in NodeRegistry.sol that zeroes reputation and permanently revokes validator status.</w:t>
+        <w:t>The PPO policy optimizes a composite reward function balancing consensus speed, fleet battery uniformity, and Byzantine safety:</w:t>
+        <w:br/>
+        <w:t>R_t = +3.0 * 1_consensus + 1.5 * E_mean - 1.0 * Var(E) - 1.2 * Latency_mean - 2.0 * ((K_t - K_min)/(K_max - K_min)) - P_BFT</w:t>
+        <w:br/>
+        <w:t>Where P_BFT = -15.0 penalizes invariant failures. Pre-trained weights were converged across 60 episodes and saved to models/drl_consensus_agent.pt.</w:t>
+      </w:r>
+    </w:p>
+    <w:p>
+      <w:pPr>
+        <w:spacing w:before="400" w:after="160"/>
+      </w:pPr>
+      <w:r>
+        <w:rPr>
+          <w:rFonts w:ascii="Calibri" w:hAnsi="Calibri"/>
+          <w:b/>
+          <w:color w:val="1F4E79"/>
+          <w:sz w:val="34"/>
+        </w:rPr>
+        <w:t>7. Adversarial Stress Testing &amp; Byzantine Slashing Defense (Phase 5)</w:t>
+      </w:r>
+    </w:p>
+    <w:p>
+      <w:pPr>
+        <w:spacing w:after="120" w:line="276" w:lineRule="auto"/>
+      </w:pPr>
+      <w:r>
+        <w:t>Phase 5 introduces an automated attack injection and defense layer safeguarding the decentralized protocol against malicious, selfish, and faulty devices.</w:t>
       </w:r>
     </w:p>
     <w:p>
@@ -1617,7 +1659,57 @@
           <w:color w:val="2E75B6"/>
           <w:sz w:val="26"/>
         </w:rPr>
-        <w:t>6.3 Phase 6: Empirical Benchmarking &amp; Final Thesis Defense</w:t>
+        <w:t>7.1 Attack Vector Formulations</w:t>
+      </w:r>
+    </w:p>
+    <w:p>
+      <w:pPr>
+        <w:pStyle w:val="ListBullet"/>
+        <w:spacing w:after="60" w:line="276" w:lineRule="auto"/>
+      </w:pPr>
+      <w:r>
+        <w:t>Telemetry Spoofing (Free-Rider): Low-battery nodes falsify their telemetry packets, reporting 100% battery and 5 ms latency to game the AI into selecting them as leader.</w:t>
+      </w:r>
+    </w:p>
+    <w:p>
+      <w:pPr>
+        <w:pStyle w:val="ListBullet"/>
+        <w:spacing w:after="60" w:line="276" w:lineRule="auto"/>
+      </w:pPr>
+      <w:r>
+        <w:t>Byzantine Equivocation: A malicious validator produces two conflicting block proposal signatures for the same epoch (double-signing).</w:t>
+      </w:r>
+    </w:p>
+    <w:p>
+      <w:pPr>
+        <w:pStyle w:val="ListBullet"/>
+        <w:spacing w:after="60" w:line="276" w:lineRule="auto"/>
+      </w:pPr>
+      <w:r>
+        <w:t>Sybil Infiltration: An unregistered cryptographic identity attempts to inject unauthorized votes into the quorum pool.</w:t>
+      </w:r>
+    </w:p>
+    <w:p>
+      <w:pPr>
+        <w:pStyle w:val="ListBullet"/>
+        <w:spacing w:after="60" w:line="276" w:lineRule="auto"/>
+      </w:pPr>
+      <w:r>
+        <w:t>Silent Dropping (DoS): An elected validator abruptly stops transmitting, simulating packet drops, network partitions, or node death.</w:t>
+      </w:r>
+    </w:p>
+    <w:p>
+      <w:pPr>
+        <w:spacing w:before="280" w:after="120"/>
+      </w:pPr>
+      <w:r>
+        <w:rPr>
+          <w:rFonts w:ascii="Calibri" w:hAnsi="Calibri"/>
+          <w:b/>
+          <w:color w:val="2E75B6"/>
+          <w:sz w:val="26"/>
+        </w:rPr>
+        <w:t>7.2 Multi-Tier Defense Mechanisms</w:t>
       </w:r>
     </w:p>
     <w:p>
@@ -1625,7 +1717,13 @@
         <w:spacing w:after="120" w:line="276" w:lineRule="auto"/>
       </w:pPr>
       <w:r>
-        <w:t>Phase 6 provides academic evaluation against two industry baselines: Classical Static PBFT and Standard Stake-based PoS. Evaluated metrics include First Node Dead (FND, target 2.5x to 4x extension), Network Half-Life, Transaction Throughput (TPS), and EVM execution gas costs optimized using bitmap storage.</w:t>
+        <w:t>1. Physics-Informed Heinzelman Consistency Checker: The AI controller checks incoming battery claims against the theoretical minimum discharge from the previous round's role. If a node reports an impossible positive jump or fails to dissipate expected radio energy, it is flagged as a free-rider, its reading is corrected, and its reputation is degraded by 50%.</w:t>
+        <w:br/>
+        <w:t>2. Cryptographic Equivocation Slasher: Conflicting signatures for identical epochs are verified via ecrecover. Upon cryptographic proof confirmation, the offending node is slashed on-chain in NodeRegistry.sol, zeroing its reputation and permanently disqualifying it.</w:t>
+        <w:br/>
+        <w:t>3. Whitelist Sybil Filter: Unregistered identities are rejected before vote aggregation, preventing Sybil attacks.</w:t>
+        <w:br/>
+        <w:t>4. Byzantine Liveness Guard: Quorum threshold guarantees that consensus finality proceeds uninterrupted as long as faults &lt;= f.</w:t>
       </w:r>
     </w:p>
     <w:p>
@@ -1639,7 +1737,753 @@
           <w:color w:val="1F4E79"/>
           <w:sz w:val="34"/>
         </w:rPr>
-        <w:t>7. Complete 10-Slide Mid-Semester Presentation Script</w:t>
+        <w:t>8. Empirical Benchmarking &amp; Research Evaluation (Phase 6)</w:t>
+      </w:r>
+    </w:p>
+    <w:p>
+      <w:pPr>
+        <w:spacing w:after="120" w:line="276" w:lineRule="auto"/>
+      </w:pPr>
+      <w:r>
+        <w:t>To rigorously quantify research contributions, Phase 6 conducts long-horizon comparative simulations against two foundational paradigms under identical radio physics: (1) Classical Static PBFT, and (2) Static Stake-Based PoS with fixed validators.</w:t>
+      </w:r>
+    </w:p>
+    <w:tbl>
+      <w:tblPr>
+        <w:tblW w:type="auto" w:w="0"/>
+        <w:jc w:val="center"/>
+        <w:tblLook w:firstColumn="1" w:firstRow="1" w:lastColumn="0" w:lastRow="0" w:noHBand="0" w:noVBand="1" w:val="04A0"/>
+      </w:tblPr>
+      <w:tblGrid>
+        <w:gridCol w:w="1560"/>
+        <w:gridCol w:w="1560"/>
+        <w:gridCol w:w="1560"/>
+        <w:gridCol w:w="1560"/>
+        <w:gridCol w:w="1560"/>
+        <w:gridCol w:w="1560"/>
+      </w:tblGrid>
+      <w:tr>
+        <w:tc>
+          <w:tcPr>
+            <w:tcW w:type="dxa" w:w="1560"/>
+            <w:shd w:fill="1F4E79"/>
+            <w:tcMar>
+              <w:top w:w="80" w:type="dxa"/>
+              <w:bottom w:w="80" w:type="dxa"/>
+              <w:left w:w="100" w:type="dxa"/>
+              <w:right w:w="100" w:type="dxa"/>
+            </w:tcMar>
+          </w:tcPr>
+          <w:p>
+            <w:r>
+              <w:rPr>
+                <w:b/>
+                <w:color w:val="FFFFFF"/>
+              </w:rPr>
+              <w:t>Consensus Protocol</w:t>
+            </w:r>
+          </w:p>
+        </w:tc>
+        <w:tc>
+          <w:tcPr>
+            <w:tcW w:type="dxa" w:w="1560"/>
+            <w:shd w:fill="1F4E79"/>
+            <w:tcMar>
+              <w:top w:w="80" w:type="dxa"/>
+              <w:bottom w:w="80" w:type="dxa"/>
+              <w:left w:w="100" w:type="dxa"/>
+              <w:right w:w="100" w:type="dxa"/>
+            </w:tcMar>
+          </w:tcPr>
+          <w:p>
+            <w:r>
+              <w:rPr>
+                <w:b/>
+                <w:color w:val="FFFFFF"/>
+              </w:rPr>
+              <w:t>FND (Round)</w:t>
+            </w:r>
+          </w:p>
+        </w:tc>
+        <w:tc>
+          <w:tcPr>
+            <w:tcW w:type="dxa" w:w="1560"/>
+            <w:shd w:fill="1F4E79"/>
+            <w:tcMar>
+              <w:top w:w="80" w:type="dxa"/>
+              <w:bottom w:w="80" w:type="dxa"/>
+              <w:left w:w="100" w:type="dxa"/>
+              <w:right w:w="100" w:type="dxa"/>
+            </w:tcMar>
+          </w:tcPr>
+          <w:p>
+            <w:r>
+              <w:rPr>
+                <w:b/>
+                <w:color w:val="FFFFFF"/>
+              </w:rPr>
+              <w:t>Half-Life</w:t>
+            </w:r>
+          </w:p>
+        </w:tc>
+        <w:tc>
+          <w:tcPr>
+            <w:tcW w:type="dxa" w:w="1560"/>
+            <w:shd w:fill="1F4E79"/>
+            <w:tcMar>
+              <w:top w:w="80" w:type="dxa"/>
+              <w:bottom w:w="80" w:type="dxa"/>
+              <w:left w:w="100" w:type="dxa"/>
+              <w:right w:w="100" w:type="dxa"/>
+            </w:tcMar>
+          </w:tcPr>
+          <w:p>
+            <w:r>
+              <w:rPr>
+                <w:b/>
+                <w:color w:val="FFFFFF"/>
+              </w:rPr>
+              <w:t>Energy (J)</w:t>
+            </w:r>
+          </w:p>
+        </w:tc>
+        <w:tc>
+          <w:tcPr>
+            <w:tcW w:type="dxa" w:w="1560"/>
+            <w:shd w:fill="1F4E79"/>
+            <w:tcMar>
+              <w:top w:w="80" w:type="dxa"/>
+              <w:bottom w:w="80" w:type="dxa"/>
+              <w:left w:w="100" w:type="dxa"/>
+              <w:right w:w="100" w:type="dxa"/>
+            </w:tcMar>
+          </w:tcPr>
+          <w:p>
+            <w:r>
+              <w:rPr>
+                <w:b/>
+                <w:color w:val="FFFFFF"/>
+              </w:rPr>
+              <w:t>Messages</w:t>
+            </w:r>
+          </w:p>
+        </w:tc>
+        <w:tc>
+          <w:tcPr>
+            <w:tcW w:type="dxa" w:w="1560"/>
+            <w:shd w:fill="1F4E79"/>
+            <w:tcMar>
+              <w:top w:w="80" w:type="dxa"/>
+              <w:bottom w:w="80" w:type="dxa"/>
+              <w:left w:w="100" w:type="dxa"/>
+              <w:right w:w="100" w:type="dxa"/>
+            </w:tcMar>
+          </w:tcPr>
+          <w:p>
+            <w:r>
+              <w:rPr>
+                <w:b/>
+                <w:color w:val="FFFFFF"/>
+              </w:rPr>
+              <w:t>Energy Saved %</w:t>
+            </w:r>
+          </w:p>
+        </w:tc>
+      </w:tr>
+      <w:tr>
+        <w:tc>
+          <w:tcPr>
+            <w:tcW w:type="dxa" w:w="1560"/>
+            <w:shd w:fill="FFFFFF"/>
+            <w:tcMar>
+              <w:top w:w="60" w:type="dxa"/>
+              <w:bottom w:w="60" w:type="dxa"/>
+              <w:left w:w="100" w:type="dxa"/>
+              <w:right w:w="100" w:type="dxa"/>
+            </w:tcMar>
+          </w:tcPr>
+          <w:p>
+            <w:r>
+              <w:t>Static PBFT (All N=14)</w:t>
+            </w:r>
+          </w:p>
+        </w:tc>
+        <w:tc>
+          <w:tcPr>
+            <w:tcW w:type="dxa" w:w="1560"/>
+            <w:shd w:fill="FFFFFF"/>
+            <w:tcMar>
+              <w:top w:w="60" w:type="dxa"/>
+              <w:bottom w:w="60" w:type="dxa"/>
+              <w:left w:w="100" w:type="dxa"/>
+              <w:right w:w="100" w:type="dxa"/>
+            </w:tcMar>
+          </w:tcPr>
+          <w:p>
+            <w:r>
+              <w:t>Round 6</w:t>
+            </w:r>
+          </w:p>
+        </w:tc>
+        <w:tc>
+          <w:tcPr>
+            <w:tcW w:type="dxa" w:w="1560"/>
+            <w:shd w:fill="FFFFFF"/>
+            <w:tcMar>
+              <w:top w:w="60" w:type="dxa"/>
+              <w:bottom w:w="60" w:type="dxa"/>
+              <w:left w:w="100" w:type="dxa"/>
+              <w:right w:w="100" w:type="dxa"/>
+            </w:tcMar>
+          </w:tcPr>
+          <w:p>
+            <w:r>
+              <w:t>Round 59</w:t>
+            </w:r>
+          </w:p>
+        </w:tc>
+        <w:tc>
+          <w:tcPr>
+            <w:tcW w:type="dxa" w:w="1560"/>
+            <w:shd w:fill="FFFFFF"/>
+            <w:tcMar>
+              <w:top w:w="60" w:type="dxa"/>
+              <w:bottom w:w="60" w:type="dxa"/>
+              <w:left w:w="100" w:type="dxa"/>
+              <w:right w:w="100" w:type="dxa"/>
+            </w:tcMar>
+          </w:tcPr>
+          <w:p>
+            <w:r>
+              <w:t>352,470 J</w:t>
+            </w:r>
+          </w:p>
+        </w:tc>
+        <w:tc>
+          <w:tcPr>
+            <w:tcW w:type="dxa" w:w="1560"/>
+            <w:shd w:fill="FFFFFF"/>
+            <w:tcMar>
+              <w:top w:w="60" w:type="dxa"/>
+              <w:bottom w:w="60" w:type="dxa"/>
+              <w:left w:w="100" w:type="dxa"/>
+              <w:right w:w="100" w:type="dxa"/>
+            </w:tcMar>
+          </w:tcPr>
+          <w:p>
+            <w:r>
+              <w:t>6,850</w:t>
+            </w:r>
+          </w:p>
+        </w:tc>
+        <w:tc>
+          <w:tcPr>
+            <w:tcW w:type="dxa" w:w="1560"/>
+            <w:shd w:fill="FFFFFF"/>
+            <w:tcMar>
+              <w:top w:w="60" w:type="dxa"/>
+              <w:bottom w:w="60" w:type="dxa"/>
+              <w:left w:w="100" w:type="dxa"/>
+              <w:right w:w="100" w:type="dxa"/>
+            </w:tcMar>
+          </w:tcPr>
+          <w:p>
+            <w:r>
+              <w:t>0.0% (Baseline)</w:t>
+            </w:r>
+          </w:p>
+        </w:tc>
+      </w:tr>
+      <w:tr>
+        <w:tc>
+          <w:tcPr>
+            <w:tcW w:type="dxa" w:w="1560"/>
+            <w:shd w:fill="F9FBFD"/>
+            <w:tcMar>
+              <w:top w:w="60" w:type="dxa"/>
+              <w:bottom w:w="60" w:type="dxa"/>
+              <w:left w:w="100" w:type="dxa"/>
+              <w:right w:w="100" w:type="dxa"/>
+            </w:tcMar>
+          </w:tcPr>
+          <w:p>
+            <w:r>
+              <w:t>Static PoS (Fixed Stake)</w:t>
+            </w:r>
+          </w:p>
+        </w:tc>
+        <w:tc>
+          <w:tcPr>
+            <w:tcW w:type="dxa" w:w="1560"/>
+            <w:shd w:fill="F9FBFD"/>
+            <w:tcMar>
+              <w:top w:w="60" w:type="dxa"/>
+              <w:bottom w:w="60" w:type="dxa"/>
+              <w:left w:w="100" w:type="dxa"/>
+              <w:right w:w="100" w:type="dxa"/>
+            </w:tcMar>
+          </w:tcPr>
+          <w:p>
+            <w:r>
+              <w:t>Round 15</w:t>
+            </w:r>
+          </w:p>
+        </w:tc>
+        <w:tc>
+          <w:tcPr>
+            <w:tcW w:type="dxa" w:w="1560"/>
+            <w:shd w:fill="F9FBFD"/>
+            <w:tcMar>
+              <w:top w:w="60" w:type="dxa"/>
+              <w:bottom w:w="60" w:type="dxa"/>
+              <w:left w:w="100" w:type="dxa"/>
+              <w:right w:w="100" w:type="dxa"/>
+            </w:tcMar>
+          </w:tcPr>
+          <w:p>
+            <w:r>
+              <w:t>None (&gt;100)</w:t>
+            </w:r>
+          </w:p>
+        </w:tc>
+        <w:tc>
+          <w:tcPr>
+            <w:tcW w:type="dxa" w:w="1560"/>
+            <w:shd w:fill="F9FBFD"/>
+            <w:tcMar>
+              <w:top w:w="60" w:type="dxa"/>
+              <w:bottom w:w="60" w:type="dxa"/>
+              <w:left w:w="100" w:type="dxa"/>
+              <w:right w:w="100" w:type="dxa"/>
+            </w:tcMar>
+          </w:tcPr>
+          <w:p>
+            <w:r>
+              <w:t>48,404 J</w:t>
+            </w:r>
+          </w:p>
+        </w:tc>
+        <w:tc>
+          <w:tcPr>
+            <w:tcW w:type="dxa" w:w="1560"/>
+            <w:shd w:fill="F9FBFD"/>
+            <w:tcMar>
+              <w:top w:w="60" w:type="dxa"/>
+              <w:bottom w:w="60" w:type="dxa"/>
+              <w:left w:w="100" w:type="dxa"/>
+              <w:right w:w="100" w:type="dxa"/>
+            </w:tcMar>
+          </w:tcPr>
+          <w:p>
+            <w:r>
+              <w:t>240</w:t>
+            </w:r>
+          </w:p>
+        </w:tc>
+        <w:tc>
+          <w:tcPr>
+            <w:tcW w:type="dxa" w:w="1560"/>
+            <w:shd w:fill="F9FBFD"/>
+            <w:tcMar>
+              <w:top w:w="60" w:type="dxa"/>
+              <w:bottom w:w="60" w:type="dxa"/>
+              <w:left w:w="100" w:type="dxa"/>
+              <w:right w:w="100" w:type="dxa"/>
+            </w:tcMar>
+          </w:tcPr>
+          <w:p>
+            <w:r>
+              <w:t>86.3% (Unbalanced)</w:t>
+            </w:r>
+          </w:p>
+        </w:tc>
+      </w:tr>
+      <w:tr>
+        <w:tc>
+          <w:tcPr>
+            <w:tcW w:type="dxa" w:w="1560"/>
+            <w:shd w:fill="FFFFFF"/>
+            <w:tcMar>
+              <w:top w:w="60" w:type="dxa"/>
+              <w:bottom w:w="60" w:type="dxa"/>
+              <w:left w:w="100" w:type="dxa"/>
+              <w:right w:w="100" w:type="dxa"/>
+            </w:tcMar>
+          </w:tcPr>
+          <w:p>
+            <w:r>
+              <w:t>AI Adaptive Consensus</w:t>
+            </w:r>
+          </w:p>
+        </w:tc>
+        <w:tc>
+          <w:tcPr>
+            <w:tcW w:type="dxa" w:w="1560"/>
+            <w:shd w:fill="FFFFFF"/>
+            <w:tcMar>
+              <w:top w:w="60" w:type="dxa"/>
+              <w:bottom w:w="60" w:type="dxa"/>
+              <w:left w:w="100" w:type="dxa"/>
+              <w:right w:w="100" w:type="dxa"/>
+            </w:tcMar>
+          </w:tcPr>
+          <w:p>
+            <w:r>
+              <w:t>None (&gt;100)</w:t>
+            </w:r>
+          </w:p>
+        </w:tc>
+        <w:tc>
+          <w:tcPr>
+            <w:tcW w:type="dxa" w:w="1560"/>
+            <w:shd w:fill="FFFFFF"/>
+            <w:tcMar>
+              <w:top w:w="60" w:type="dxa"/>
+              <w:bottom w:w="60" w:type="dxa"/>
+              <w:left w:w="100" w:type="dxa"/>
+              <w:right w:w="100" w:type="dxa"/>
+            </w:tcMar>
+          </w:tcPr>
+          <w:p>
+            <w:r>
+              <w:t>None (&gt;100)</w:t>
+            </w:r>
+          </w:p>
+        </w:tc>
+        <w:tc>
+          <w:tcPr>
+            <w:tcW w:type="dxa" w:w="1560"/>
+            <w:shd w:fill="FFFFFF"/>
+            <w:tcMar>
+              <w:top w:w="60" w:type="dxa"/>
+              <w:bottom w:w="60" w:type="dxa"/>
+              <w:left w:w="100" w:type="dxa"/>
+              <w:right w:w="100" w:type="dxa"/>
+            </w:tcMar>
+          </w:tcPr>
+          <w:p>
+            <w:r>
+              <w:t>246,201 J</w:t>
+            </w:r>
+          </w:p>
+        </w:tc>
+        <w:tc>
+          <w:tcPr>
+            <w:tcW w:type="dxa" w:w="1560"/>
+            <w:shd w:fill="FFFFFF"/>
+            <w:tcMar>
+              <w:top w:w="60" w:type="dxa"/>
+              <w:bottom w:w="60" w:type="dxa"/>
+              <w:left w:w="100" w:type="dxa"/>
+              <w:right w:w="100" w:type="dxa"/>
+            </w:tcMar>
+          </w:tcPr>
+          <w:p>
+            <w:r>
+              <w:t>954</w:t>
+            </w:r>
+          </w:p>
+        </w:tc>
+        <w:tc>
+          <w:tcPr>
+            <w:tcW w:type="dxa" w:w="1560"/>
+            <w:shd w:fill="FFFFFF"/>
+            <w:tcMar>
+              <w:top w:w="60" w:type="dxa"/>
+              <w:bottom w:w="60" w:type="dxa"/>
+              <w:left w:w="100" w:type="dxa"/>
+              <w:right w:w="100" w:type="dxa"/>
+            </w:tcMar>
+          </w:tcPr>
+          <w:p>
+            <w:r>
+              <w:t>30.1% (Balanced)</w:t>
+            </w:r>
+          </w:p>
+        </w:tc>
+      </w:tr>
+    </w:tbl>
+    <w:tbl>
+      <w:tblPr>
+        <w:tblW w:type="auto" w:w="0"/>
+        <w:jc w:val="center"/>
+        <w:tblLook w:firstColumn="1" w:firstRow="1" w:lastColumn="0" w:lastRow="0" w:noHBand="0" w:noVBand="1" w:val="04A0"/>
+      </w:tblPr>
+      <w:tblGrid>
+        <w:gridCol w:w="9360"/>
+      </w:tblGrid>
+      <w:tr>
+        <w:tc>
+          <w:tcPr>
+            <w:tcW w:type="dxa" w:w="9360"/>
+            <w:shd w:fill="EDF4F9"/>
+            <w:tcMar>
+              <w:top w:w="120" w:type="dxa"/>
+              <w:bottom w:w="120" w:type="dxa"/>
+              <w:left w:w="180" w:type="dxa"/>
+              <w:right w:w="180" w:type="dxa"/>
+            </w:tcMar>
+          </w:tcPr>
+          <w:p>
+            <w:r>
+              <w:rPr>
+                <w:b/>
+              </w:rPr>
+              <w:t xml:space="preserve">[BENCHMARK BREAKTHROUGH] </w:t>
+            </w:r>
+            <w:r>
+              <w:rPr>
+                <w:i/>
+              </w:rPr>
+              <w:t>Key Empirical Finding: In Static PBFT, the first node dies in Round 6 due to continuous N^2 broadcasts. In Static PoS, the fixed leader burns out in Round 15, partitioning the network. In AI Adaptive Consensus, ZERO nodes died across all 100 rounds (FND &gt; 100), representing an over 6.67x extension in operational lifespan over PoS, and over 16x extension over PBFT.</w:t>
+            </w:r>
+          </w:p>
+        </w:tc>
+      </w:tr>
+    </w:tbl>
+    <w:p>
+      <w:pPr>
+        <w:spacing w:after="80"/>
+      </w:pPr>
+    </w:p>
+    <w:p>
+      <w:pPr>
+        <w:spacing w:before="280" w:after="120"/>
+      </w:pPr>
+      <w:r>
+        <w:rPr>
+          <w:rFonts w:ascii="Calibri" w:hAnsi="Calibri"/>
+          <w:b/>
+          <w:color w:val="2E75B6"/>
+          <w:sz w:val="26"/>
+        </w:rPr>
+        <w:t>8.1 Publication Figures &amp; Graphical Analysis</w:t>
+      </w:r>
+    </w:p>
+    <w:p>
+      <w:pPr>
+        <w:jc w:val="center"/>
+      </w:pPr>
+    </w:p>
+    <w:p>
+      <w:r>
+        <w:drawing>
+          <wp:inline xmlns:a="http://schemas.openxmlformats.org/drawingml/2006/main" xmlns:pic="http://schemas.openxmlformats.org/drawingml/2006/picture">
+            <wp:extent cx="5303520" cy="1591056"/>
+            <wp:docPr id="1" name="Picture 1"/>
+            <wp:cNvGraphicFramePr>
+              <a:graphicFrameLocks noChangeAspect="1"/>
+            </wp:cNvGraphicFramePr>
+            <a:graphic>
+              <a:graphicData uri="http://schemas.openxmlformats.org/drawingml/2006/picture">
+                <pic:pic>
+                  <pic:nvPicPr>
+                    <pic:cNvPr id="0" name="battery_decay_curves.png"/>
+                    <pic:cNvPicPr/>
+                  </pic:nvPicPr>
+                  <pic:blipFill>
+                    <a:blip r:embed="rId9"/>
+                    <a:stretch>
+                      <a:fillRect/>
+                    </a:stretch>
+                  </pic:blipFill>
+                  <pic:spPr>
+                    <a:xfrm>
+                      <a:off x="0" y="0"/>
+                      <a:ext cx="5303520" cy="1591056"/>
+                    </a:xfrm>
+                    <a:prstGeom prst="rect"/>
+                  </pic:spPr>
+                </pic:pic>
+              </a:graphicData>
+            </a:graphic>
+          </wp:inline>
+        </w:drawing>
+      </w:r>
+    </w:p>
+    <w:p>
+      <w:pPr>
+        <w:spacing w:after="280"/>
+        <w:jc w:val="center"/>
+      </w:pPr>
+      <w:r>
+        <w:rPr>
+          <w:i/>
+        </w:rPr>
+        <w:t>Figure 1: Individual Node Battery Decay Curves Across Consensus Paradigms. Demonstrates uniform, balanced discharge in Adaptive Consensus versus rapid single-node burnout in PoS and parallel collapse in PBFT.</w:t>
+      </w:r>
+    </w:p>
+    <w:p>
+      <w:pPr>
+        <w:jc w:val="center"/>
+      </w:pPr>
+    </w:p>
+    <w:p>
+      <w:r>
+        <w:drawing>
+          <wp:inline xmlns:a="http://schemas.openxmlformats.org/drawingml/2006/main" xmlns:pic="http://schemas.openxmlformats.org/drawingml/2006/picture">
+            <wp:extent cx="5303520" cy="3314700"/>
+            <wp:docPr id="2" name="Picture 2"/>
+            <wp:cNvGraphicFramePr>
+              <a:graphicFrameLocks noChangeAspect="1"/>
+            </wp:cNvGraphicFramePr>
+            <a:graphic>
+              <a:graphicData uri="http://schemas.openxmlformats.org/drawingml/2006/picture">
+                <pic:pic>
+                  <pic:nvPicPr>
+                    <pic:cNvPr id="0" name="cumulative_energy_comparison.png"/>
+                    <pic:cNvPicPr/>
+                  </pic:nvPicPr>
+                  <pic:blipFill>
+                    <a:blip r:embed="rId10"/>
+                    <a:stretch>
+                      <a:fillRect/>
+                    </a:stretch>
+                  </pic:blipFill>
+                  <pic:spPr>
+                    <a:xfrm>
+                      <a:off x="0" y="0"/>
+                      <a:ext cx="5303520" cy="3314700"/>
+                    </a:xfrm>
+                    <a:prstGeom prst="rect"/>
+                  </pic:spPr>
+                </pic:pic>
+              </a:graphicData>
+            </a:graphic>
+          </wp:inline>
+        </w:drawing>
+      </w:r>
+    </w:p>
+    <w:p>
+      <w:pPr>
+        <w:spacing w:after="280"/>
+        <w:jc w:val="center"/>
+      </w:pPr>
+      <w:r>
+        <w:rPr>
+          <w:i/>
+        </w:rPr>
+        <w:t>Figure 2: Cumulative Energy Dissipation Trajectory. Adaptive Consensus preserves over 30% total fleet energy compared to PBFT while maintaining full BFT security.</w:t>
+      </w:r>
+    </w:p>
+    <w:p>
+      <w:pPr>
+        <w:jc w:val="center"/>
+      </w:pPr>
+    </w:p>
+    <w:p>
+      <w:r>
+        <w:drawing>
+          <wp:inline xmlns:a="http://schemas.openxmlformats.org/drawingml/2006/main" xmlns:pic="http://schemas.openxmlformats.org/drawingml/2006/picture">
+            <wp:extent cx="5303520" cy="3314700"/>
+            <wp:docPr id="3" name="Picture 3"/>
+            <wp:cNvGraphicFramePr>
+              <a:graphicFrameLocks noChangeAspect="1"/>
+            </wp:cNvGraphicFramePr>
+            <a:graphic>
+              <a:graphicData uri="http://schemas.openxmlformats.org/drawingml/2006/picture">
+                <pic:pic>
+                  <pic:nvPicPr>
+                    <pic:cNvPr id="0" name="network_survival_curves.png"/>
+                    <pic:cNvPicPr/>
+                  </pic:nvPicPr>
+                  <pic:blipFill>
+                    <a:blip r:embed="rId11"/>
+                    <a:stretch>
+                      <a:fillRect/>
+                    </a:stretch>
+                  </pic:blipFill>
+                  <pic:spPr>
+                    <a:xfrm>
+                      <a:off x="0" y="0"/>
+                      <a:ext cx="5303520" cy="3314700"/>
+                    </a:xfrm>
+                    <a:prstGeom prst="rect"/>
+                  </pic:spPr>
+                </pic:pic>
+              </a:graphicData>
+            </a:graphic>
+          </wp:inline>
+        </w:drawing>
+      </w:r>
+    </w:p>
+    <w:p>
+      <w:pPr>
+        <w:spacing w:after="280"/>
+        <w:jc w:val="center"/>
+      </w:pPr>
+      <w:r>
+        <w:rPr>
+          <w:i/>
+        </w:rPr>
+        <w:t>Figure 3: Network Survival &amp; Node Longevity Curves. Highlights First Node Dead (FND) and Network Half-Life resilience under dynamic AI role rotation.</w:t>
+      </w:r>
+    </w:p>
+    <w:p>
+      <w:pPr>
+        <w:jc w:val="center"/>
+      </w:pPr>
+    </w:p>
+    <w:p>
+      <w:r>
+        <w:drawing>
+          <wp:inline xmlns:a="http://schemas.openxmlformats.org/drawingml/2006/main" xmlns:pic="http://schemas.openxmlformats.org/drawingml/2006/picture">
+            <wp:extent cx="5303520" cy="3314700"/>
+            <wp:docPr id="4" name="Picture 4"/>
+            <wp:cNvGraphicFramePr>
+              <a:graphicFrameLocks noChangeAspect="1"/>
+            </wp:cNvGraphicFramePr>
+            <a:graphic>
+              <a:graphicData uri="http://schemas.openxmlformats.org/drawingml/2006/picture">
+                <pic:pic>
+                  <pic:nvPicPr>
+                    <pic:cNvPr id="0" name="message_complexity_scaling.png"/>
+                    <pic:cNvPicPr/>
+                  </pic:nvPicPr>
+                  <pic:blipFill>
+                    <a:blip r:embed="rId12"/>
+                    <a:stretch>
+                      <a:fillRect/>
+                    </a:stretch>
+                  </pic:blipFill>
+                  <pic:spPr>
+                    <a:xfrm>
+                      <a:off x="0" y="0"/>
+                      <a:ext cx="5303520" cy="3314700"/>
+                    </a:xfrm>
+                    <a:prstGeom prst="rect"/>
+                  </pic:spPr>
+                </pic:pic>
+              </a:graphicData>
+            </a:graphic>
+          </wp:inline>
+        </w:drawing>
+      </w:r>
+    </w:p>
+    <w:p>
+      <w:pPr>
+        <w:spacing w:after="280"/>
+        <w:jc w:val="center"/>
+      </w:pPr>
+      <w:r>
+        <w:rPr>
+          <w:i/>
+        </w:rPr>
+        <w:t>Figure 4: Communication Message Complexity Scaling. Compares O(N^2) quadratic messaging in PBFT versus O(K^2) bounded messaging in AI Adaptive Consensus as network size scales from 10 to 100 devices.</w:t>
+      </w:r>
+    </w:p>
+    <w:p>
+      <w:pPr>
+        <w:spacing w:before="400" w:after="160"/>
+      </w:pPr>
+      <w:r>
+        <w:rPr>
+          <w:rFonts w:ascii="Calibri" w:hAnsi="Calibri"/>
+          <w:b/>
+          <w:color w:val="1F4E79"/>
+          <w:sz w:val="34"/>
+        </w:rPr>
+        <w:t>9. Complete 10-Slide Project Presentation Script</w:t>
       </w:r>
     </w:p>
     <w:p>
@@ -1653,7 +2497,7 @@
         <w:t xml:space="preserve">Slide 1: Title &amp; Overview: </w:t>
       </w:r>
       <w:r>
-        <w:t>AI-Driven Adaptive Consensus Mechanism for Energy-Efficient Blockchain IoT Networks. Introduces the decoupled 3-tier model balancing decentralized security with device battery preservation.</w:t>
+        <w:t>AI-Driven Adaptive Consensus Mechanism for Energy-Efficient Blockchain IoT Networks. Introduces the decoupled 3-tier architecture balancing decentralized Byzantine security with microcontroller battery preservation.</w:t>
       </w:r>
     </w:p>
     <w:p>
@@ -1667,7 +2511,7 @@
         <w:t xml:space="preserve">Slide 2: The Core Problem: </w:t>
       </w:r>
       <w:r>
-        <w:t>Details why traditional blockchains fail on IoT hardware: PoW exhausts battery in hours, PBFT causes O(N^2) broadcast packet storms, and PoS is energy-blind, killing peripheral sensors.</w:t>
+        <w:t>Details why canonical consensus fails on IoT hardware: PoW exhausts battery in hours, PBFT causes O(N^2) packet collision storms, and PoS is energy-blind, burning out peripheral sensors.</w:t>
       </w:r>
     </w:p>
     <w:p>
@@ -1678,10 +2522,10 @@
         <w:rPr>
           <w:b/>
         </w:rPr>
-        <w:t xml:space="preserve">Slide 3: Proposed Architecture: </w:t>
+        <w:t xml:space="preserve">Slide 3: Theoretical System &amp; Radio Physics: </w:t>
       </w:r>
       <w:r>
-        <w:t>Explains the 3-tier boundary: Tier 1 Simulated IoT Devices -&gt; Tier 2 Edge AI Controller -&gt; Tier 3 Solidity Smart Contracts on the EVM.</w:t>
+        <w:t>Presents the Heinzelman first-order radio model, the crossover threshold (d0 = 87.71m), and the BFT safety floor (K_t &gt;= 3f + 1, Quorum = floor(2/3*K) + 1).</w:t>
       </w:r>
     </w:p>
     <w:p>
@@ -1692,10 +2536,10 @@
         <w:rPr>
           <w:b/>
         </w:rPr>
-        <w:t xml:space="preserve">Slide 4: Mathematical Formulations: </w:t>
+        <w:t xml:space="preserve">Slide 4: Decoupled 3-Tier Architecture: </w:t>
       </w:r>
       <w:r>
-        <w:t>Presents the Heinzelman first-order radio model, the BFT safety bound (K_t &gt;= 3f + 1), and the multi-objective global utility function (U_t = w1*S + w2*E - w3*L).</w:t>
+        <w:t>Explains architectural separation: Tier 1 Virtual ESP32 Fleet -&gt; Tier 2 Edge AI Controller / Oracle -&gt; Tier 3 Solidity Smart Contracts on the EVM (NodeRegistry.sol and AdaptiveConsensus.sol).</w:t>
       </w:r>
     </w:p>
     <w:p>
@@ -1706,10 +2550,10 @@
         <w:rPr>
           <w:b/>
         </w:rPr>
-        <w:t xml:space="preserve">Slide 5: Prototype Implementation: </w:t>
+        <w:t xml:space="preserve">Slide 5: Phase 4 Deep Reinforcement Learning: </w:t>
       </w:r>
       <w:r>
-        <w:t>Details the implementation: NodeRegistry.sol and AdaptiveConsensus.sol tested in Hardhat, virtual ESP32 nodes with ECDSA secp256k1 signing, and Web3.py integration.</w:t>
+        <w:t>Details upgrading to Actor-Critic PPO policy network trained in a Gymnasium MDP environment, optimizing composite rewards over a 58-dimensional state space.</w:t>
       </w:r>
     </w:p>
     <w:p>
@@ -1720,10 +2564,10 @@
         <w:rPr>
           <w:b/>
         </w:rPr>
-        <w:t xml:space="preserve">Slide 6: Demonstration &amp; Results: </w:t>
+        <w:t xml:space="preserve">Slide 6: Phase 5 Adversarial Attack Suite: </w:t>
       </w:r>
       <w:r>
-        <w:t>Highlights prototype results: 98.3% energy reduction for idle nodes, automated leader fatigue rotation, dynamic 10% battery quarantine stress test, and the interactive Streamlit dashboard.</w:t>
+        <w:t>Outlines simulated attacks: Telemetry Spoofing, Byzantine Double-Signing, Sybil Infiltration, and Validator Silent Dropping, with automated physics-based sanitization and on-chain slashing.</w:t>
       </w:r>
     </w:p>
     <w:p>
@@ -1734,10 +2578,10 @@
         <w:rPr>
           <w:b/>
         </w:rPr>
-        <w:t xml:space="preserve">Slide 7: Roadmap Phase 4 (Deep RL): </w:t>
+        <w:t xml:space="preserve">Slide 7: Phase 6 Empirical Benchmarking: </w:t>
       </w:r>
       <w:r>
-        <w:t>Details replacing static heuristics with a Deep Reinforcement Learning (PPO/DQN) agent to learn non-linear policies under changing IoT network traffic.</w:t>
+        <w:t>Compares performance against Static PBFT and Fixed PoS over 100 rounds: Adaptive Consensus extends First Node Dead (FND) by over 6.67x over PoS and over 16x over PBFT.</w:t>
       </w:r>
     </w:p>
     <w:p>
@@ -1748,10 +2592,10 @@
         <w:rPr>
           <w:b/>
         </w:rPr>
-        <w:t xml:space="preserve">Slide 8: Roadmap Phase 5 (Byzantine Attacks): </w:t>
+        <w:t xml:space="preserve">Slide 8: Communication &amp; Scalability Gains: </w:t>
       </w:r>
       <w:r>
-        <w:t>Details threat mitigation: Kalman filter anomaly detection against telemetry battery spoofing, and on-chain cryptographic slashing for double-signing.</w:t>
+        <w:t>Demonstrates reduction of message complexity from quadratic O(N^2) to bounded O(K^2), cutting network packets by 86% and eliminating RF broadcast storms.</w:t>
       </w:r>
     </w:p>
     <w:p>
@@ -1762,10 +2606,10 @@
         <w:rPr>
           <w:b/>
         </w:rPr>
-        <w:t xml:space="preserve">Slide 9: Roadmap Phase 6 (Benchmarking): </w:t>
+        <w:t xml:space="preserve">Slide 9: Interactive Demonstration Interface: </w:t>
       </w:r>
       <w:r>
-        <w:t>Outlines benchmarking against Classical PBFT and PoS on First Node Dead (FND), network half-life, message complexity, and EVM gas profiling.</w:t>
+        <w:t>Showcases the real-time Streamlit dashboard with DRL/MCDM toggle, live fleet battery gauges, attack injection controls, and on-chain security audit logging.</w:t>
       </w:r>
     </w:p>
     <w:p>
@@ -1779,7 +2623,7 @@
         <w:t xml:space="preserve">Slide 10: Conclusion &amp; Deliverables: </w:t>
       </w:r>
       <w:r>
-        <w:t>Summarizes the mid-semester deliverables, project timeline leading to the final semester defense, and the research contribution of an energy-aware IoT blockchain.</w:t>
+        <w:t>Summarizes key contributions: complete 6-phase codebase, 29 passing unit tests, verified EVM contracts, publication-ready figures, and full thesis documentation.</w:t>
       </w:r>
     </w:p>
     <w:p>
@@ -1793,7 +2637,7 @@
           <w:color w:val="1F4E79"/>
           <w:sz w:val="34"/>
         </w:rPr>
-        <w:t>8. Review Panel Defense &amp; Viva Q&amp;A Guide</w:t>
+        <w:t>10. Review Panel Defense &amp; Viva Q&amp;A Guide</w:t>
       </w:r>
     </w:p>
     <w:p>
@@ -1812,7 +2656,7 @@
         <w:spacing w:after="120" w:line="276" w:lineRule="auto"/>
       </w:pPr>
       <w:r>
-        <w:t>Defense: Smart contracts cannot perform floating-point math or neural network inferences within block gas limits. However, IoT networks still require a trustless, decentralized ledger for identity registry, slashing, and quorum verification. Solidity acts as the immutable settlement layer, while Python acts as the intelligent off-chain compute engine.</w:t>
+        <w:t>Defense: Smart contracts cannot perform floating-point neural network inferences or multi-criteria optimization within block gas limits. However, IoT networks require an immutable, trustless ledger for identity registry, slashing, and quorum verification. Solidity acts as the decentralized settlement layer, while Python acts as the off-chain Edge AI compute engine.</w:t>
       </w:r>
     </w:p>
     <w:p>
@@ -1831,7 +2675,7 @@
         <w:spacing w:after="120" w:line="276" w:lineRule="auto"/>
       </w:pPr>
       <w:r>
-        <w:t>Defense: Byzantine Fault Tolerance mathematically requires K &gt;= 3f + 1 to prevent double-spending and network forks. For f = 1 malicious or offline node, the committee must have at least 4 nodes. Our AI algorithm enforces this invariant as a hard constraint.</w:t>
+        <w:t>Defense: Byzantine Fault Tolerance mathematically requires K &gt;= 3f + 1 to prevent double-spending and network forks. For f = 1 malicious or offline node, the committee must have at least 4 nodes. Our AI algorithm enforces this invariant as a non-negotiable hard constraint.</w:t>
       </w:r>
     </w:p>
     <w:p>
@@ -1861,7 +2705,7 @@
         <w:rPr>
           <w:b/>
         </w:rPr>
-        <w:t>Q: How do you prevent a node from lying about having 5% battery to avoid work?</w:t>
+        <w:t>Q: How do you prevent a node from lying about having 100% battery to seize leadership?</w:t>
       </w:r>
     </w:p>
     <w:p>
@@ -1869,7 +2713,45 @@
         <w:spacing w:after="120" w:line="276" w:lineRule="auto"/>
       </w:pPr>
       <w:r>
-        <w:t>Defense: In Phase 5, we introduce an anomaly detection filter. The controller maintains a historical model of expected energy drain based on past validation duties. If a node reports 5% battery despite being idle, or claims 99% after signing 100 blocks, it is flagged, disqualified, and penalized on-chain.</w:t>
+        <w:t>Defense: In Phase 5, we introduced a physics-informed anomaly detector. The controller maintains a historical model of expected energy drain based on past validation duties under the Heinzelman radio model. If an active node reports an impossible positive battery increase or claims 100% after signing blocks, it is flagged as a free-rider, its telemetry is corrected, and its reputation is degraded by 50%.</w:t>
+      </w:r>
+    </w:p>
+    <w:p>
+      <w:pPr>
+        <w:spacing w:before="160" w:after="80"/>
+      </w:pPr>
+      <w:r>
+        <w:rPr>
+          <w:b/>
+        </w:rPr>
+        <w:t>Q: What happens if a malicious node signs two conflicting blocks at the same epoch?</w:t>
+      </w:r>
+    </w:p>
+    <w:p>
+      <w:pPr>
+        <w:spacing w:after="120" w:line="276" w:lineRule="auto"/>
+      </w:pPr>
+      <w:r>
+        <w:t>Defense: This constitutes Byzantine Equivocation. The defense detector verifies both conflicting ECDSA signatures using ecrecover. Upon proof verification, it invokes slashNode on NodeRegistry.sol, zeroing the node's reputation and permanently blacklisting it from all future committees.</w:t>
+      </w:r>
+    </w:p>
+    <w:p>
+      <w:pPr>
+        <w:spacing w:before="160" w:after="80"/>
+      </w:pPr>
+      <w:r>
+        <w:rPr>
+          <w:b/>
+        </w:rPr>
+        <w:t>Q: How does the AI policy achieve load balancing across the fleet?</w:t>
+      </w:r>
+    </w:p>
+    <w:p>
+      <w:pPr>
+        <w:spacing w:after="120" w:line="276" w:lineRule="auto"/>
+      </w:pPr>
+      <w:r>
+        <w:t>Defense: Both the MCDM utility function and the DRL policy network incorporate a leadership fatigue penalty. After leading a round, a node incurs a high participation penalty, preventing consecutive-term monopolies and forcing dynamic round-robin rotation among the healthiest nodes.</w:t>
       </w:r>
     </w:p>
     <w:sectPr>

</xml_diff>